<commit_message>
Update README.md for LAB 4 and add README.md for LAB 5 with project details and requirements
</commit_message>
<xml_diff>
--- a/LAB_OOSD/LAB5/LAB5.docx
+++ b/LAB_OOSD/LAB5/LAB5.docx
@@ -79,6 +79,12 @@
     </w:p>
     <w:p>
       <w:pPr>
+        <w:pStyle w:val="ListParagraph"/>
+        <w:numPr>
+          <w:ilvl w:val="0"/>
+          <w:numId w:val="2"/>
+        </w:numPr>
+        <w:spacing w:line="360" w:lineRule="auto"/>
         <w:jc w:val="left"/>
         <w:rPr>
           <w:lang w:val="vi-VN"/>
@@ -88,7 +94,7 @@
         <w:rPr>
           <w:lang w:val="vi-VN"/>
         </w:rPr>
-        <w:t xml:space="preserve">-Cung cấp thông tin các </w:t>
+        <w:t xml:space="preserve">Cung cấp thông tin các </w:t>
       </w:r>
       <w:proofErr w:type="spellStart"/>
       <w:r>
@@ -183,6 +189,12 @@
     </w:p>
     <w:p>
       <w:pPr>
+        <w:pStyle w:val="ListParagraph"/>
+        <w:numPr>
+          <w:ilvl w:val="0"/>
+          <w:numId w:val="2"/>
+        </w:numPr>
+        <w:spacing w:line="360" w:lineRule="auto"/>
         <w:jc w:val="left"/>
         <w:rPr>
           <w:lang w:val="vi-VN"/>
@@ -192,16 +204,17 @@
         <w:rPr>
           <w:lang w:val="vi-VN"/>
         </w:rPr>
-        <w:t>-Quản lý tình hình đăng kí du lịch, khách đăng kí gồm 2 loại :</w:t>
+        <w:t>Quản lý tình hình đăng kí du lịch, khách đăng kí gồm 2 loại :</w:t>
       </w:r>
     </w:p>
     <w:p>
       <w:pPr>
         <w:pStyle w:val="ListParagraph"/>
         <w:numPr>
-          <w:ilvl w:val="0"/>
-          <w:numId w:val="1"/>
+          <w:ilvl w:val="1"/>
+          <w:numId w:val="4"/>
         </w:numPr>
+        <w:spacing w:line="360" w:lineRule="auto"/>
         <w:jc w:val="left"/>
         <w:rPr>
           <w:lang w:val="vi-VN"/>
@@ -247,9 +260,10 @@
       <w:pPr>
         <w:pStyle w:val="ListParagraph"/>
         <w:numPr>
-          <w:ilvl w:val="0"/>
-          <w:numId w:val="1"/>
+          <w:ilvl w:val="1"/>
+          <w:numId w:val="4"/>
         </w:numPr>
+        <w:spacing w:line="360" w:lineRule="auto"/>
         <w:jc w:val="left"/>
         <w:rPr>
           <w:lang w:val="vi-VN"/>
@@ -284,6 +298,12 @@
     </w:p>
     <w:p>
       <w:pPr>
+        <w:pStyle w:val="ListParagraph"/>
+        <w:numPr>
+          <w:ilvl w:val="0"/>
+          <w:numId w:val="2"/>
+        </w:numPr>
+        <w:spacing w:line="360" w:lineRule="auto"/>
         <w:jc w:val="left"/>
         <w:rPr>
           <w:lang w:val="vi-VN"/>
@@ -293,7 +313,7 @@
         <w:rPr>
           <w:lang w:val="vi-VN"/>
         </w:rPr>
-        <w:t xml:space="preserve">-Sắp xếp lịch thực hiện </w:t>
+        <w:t xml:space="preserve">Sắp xếp lịch thực hiện </w:t>
       </w:r>
       <w:proofErr w:type="spellStart"/>
       <w:r>
@@ -318,6 +338,12 @@
     </w:p>
     <w:p>
       <w:pPr>
+        <w:pStyle w:val="ListParagraph"/>
+        <w:numPr>
+          <w:ilvl w:val="0"/>
+          <w:numId w:val="2"/>
+        </w:numPr>
+        <w:spacing w:line="360" w:lineRule="auto"/>
         <w:jc w:val="left"/>
         <w:rPr>
           <w:lang w:val="vi-VN"/>
@@ -327,7 +353,7 @@
         <w:rPr>
           <w:lang w:val="vi-VN"/>
         </w:rPr>
-        <w:t xml:space="preserve">- Mỗi </w:t>
+        <w:t xml:space="preserve">Mỗi </w:t>
       </w:r>
       <w:proofErr w:type="spellStart"/>
       <w:r>
@@ -408,6 +434,12 @@
     </w:p>
     <w:p>
       <w:pPr>
+        <w:pStyle w:val="ListParagraph"/>
+        <w:numPr>
+          <w:ilvl w:val="0"/>
+          <w:numId w:val="2"/>
+        </w:numPr>
+        <w:spacing w:line="360" w:lineRule="auto"/>
         <w:jc w:val="left"/>
         <w:rPr>
           <w:lang w:val="vi-VN"/>
@@ -417,7 +449,7 @@
         <w:rPr>
           <w:lang w:val="vi-VN"/>
         </w:rPr>
-        <w:t xml:space="preserve">- Công ty sẽ gửi phiếu khảo sát khi kết thúc </w:t>
+        <w:t xml:space="preserve">Công ty sẽ gửi phiếu khảo sát khi kết thúc </w:t>
       </w:r>
       <w:proofErr w:type="spellStart"/>
       <w:r>
@@ -445,6 +477,7 @@
         <w:rPr>
           <w:lang w:val="vi-VN"/>
         </w:rPr>
+        <w:lastRenderedPageBreak/>
         <w:t xml:space="preserve">1.2 Yêu cầu hệ thống </w:t>
       </w:r>
     </w:p>
@@ -554,7 +587,6 @@
               <w:rPr>
                 <w:lang w:val="vi-VN"/>
               </w:rPr>
-              <w:lastRenderedPageBreak/>
               <w:t xml:space="preserve">Thông tin </w:t>
             </w:r>
             <w:proofErr w:type="spellStart"/>
@@ -2369,6 +2401,7 @@
               <w:jc w:val="left"/>
             </w:pPr>
             <w:r>
+              <w:lastRenderedPageBreak/>
               <w:t xml:space="preserve">Thanh </w:t>
             </w:r>
             <w:proofErr w:type="spellStart"/>
@@ -2622,7 +2655,6 @@
             </w:r>
             <w:proofErr w:type="spellStart"/>
             <w:r>
-              <w:lastRenderedPageBreak/>
               <w:t>nhận</w:t>
             </w:r>
             <w:proofErr w:type="spellEnd"/>
@@ -2681,7 +2713,6 @@
             </w:pPr>
             <w:proofErr w:type="spellStart"/>
             <w:r>
-              <w:lastRenderedPageBreak/>
               <w:t>Hóa</w:t>
             </w:r>
             <w:proofErr w:type="spellEnd"/>
@@ -4376,6 +4407,7 @@
               <w:jc w:val="left"/>
             </w:pPr>
             <w:r>
+              <w:lastRenderedPageBreak/>
               <w:t>BR07</w:t>
             </w:r>
           </w:p>
@@ -4603,7 +4635,6 @@
               <w:jc w:val="left"/>
             </w:pPr>
             <w:r>
-              <w:lastRenderedPageBreak/>
               <w:t>BR08</w:t>
             </w:r>
           </w:p>
@@ -5260,7 +5291,6 @@
     </w:tbl>
     <w:p>
       <w:pPr>
-        <w:pStyle w:val="Heading2"/>
         <w:rPr>
           <w:lang w:val="vi-VN"/>
         </w:rPr>
@@ -6427,6 +6457,7 @@
             </w:r>
             <w:proofErr w:type="spellStart"/>
             <w:r>
+              <w:lastRenderedPageBreak/>
               <w:t>nguyên</w:t>
             </w:r>
             <w:proofErr w:type="spellEnd"/>
@@ -8223,6 +8254,7 @@
           <w:p>
             <w:proofErr w:type="spellStart"/>
             <w:r>
+              <w:lastRenderedPageBreak/>
               <w:t>Tương</w:t>
             </w:r>
             <w:proofErr w:type="spellEnd"/>
@@ -8341,7 +8373,6 @@
     </w:p>
     <w:p>
       <w:r>
-        <w:lastRenderedPageBreak/>
         <w:t xml:space="preserve">1. </w:t>
       </w:r>
       <w:proofErr w:type="spellStart"/>
@@ -9701,6 +9732,7 @@
           </w:tcPr>
           <w:p>
             <w:r>
+              <w:lastRenderedPageBreak/>
               <w:t>6</w:t>
             </w:r>
           </w:p>
@@ -9921,7 +9953,6 @@
           </w:tcPr>
           <w:p>
             <w:r>
-              <w:lastRenderedPageBreak/>
               <w:t>7</w:t>
             </w:r>
           </w:p>
@@ -11549,6 +11580,7 @@
           </w:tcPr>
           <w:p>
             <w:r>
+              <w:lastRenderedPageBreak/>
               <w:t>14</w:t>
             </w:r>
           </w:p>
@@ -11779,7 +11811,6 @@
         <w:rPr>
           <w:lang w:val="vi-VN"/>
         </w:rPr>
-        <w:lastRenderedPageBreak/>
         <w:t xml:space="preserve"> </w:t>
       </w:r>
     </w:p>
@@ -11803,6 +11834,344 @@
 <file path=word/numbering.xml><?xml version="1.0" encoding="utf-8"?>
 <w:numbering xmlns:wpc="http://schemas.microsoft.com/office/word/2010/wordprocessingCanvas" xmlns:cx="http://schemas.microsoft.com/office/drawing/2014/chartex" xmlns:cx1="http://schemas.microsoft.com/office/drawing/2015/9/8/chartex" xmlns:cx2="http://schemas.microsoft.com/office/drawing/2015/10/21/chartex" xmlns:cx3="http://schemas.microsoft.com/office/drawing/2016/5/9/chartex" xmlns:cx4="http://schemas.microsoft.com/office/drawing/2016/5/10/chartex" xmlns:cx5="http://schemas.microsoft.com/office/drawing/2016/5/11/chartex" xmlns:cx6="http://schemas.microsoft.com/office/drawing/2016/5/12/chartex" xmlns:cx7="http://schemas.microsoft.com/office/drawing/2016/5/13/chartex" xmlns:cx8="http://schemas.microsoft.com/office/drawing/2016/5/14/chartex" xmlns:mc="http://schemas.openxmlformats.org/markup-compatibility/2006" xmlns:aink="http://schemas.microsoft.com/office/drawing/2016/ink" xmlns:am3d="http://schemas.microsoft.com/office/drawing/2017/model3d" xmlns:o="urn:schemas-microsoft-com:office:office" xmlns:oel="http://schemas.microsoft.com/office/2019/extlst" xmlns:r="http://schemas.openxmlformats.org/officeDocument/2006/relationships" xmlns:m="http://schemas.openxmlformats.org/officeDocument/2006/math" xmlns:v="urn:schemas-microsoft-com:vml" xmlns:wp14="http://schemas.microsoft.com/office/word/2010/wordprocessingDrawing" xmlns:wp="http://schemas.openxmlformats.org/drawingml/2006/wordprocessingDrawing" xmlns:w10="urn:schemas-microsoft-com:office:word" xmlns:w="http://schemas.openxmlformats.org/wordprocessingml/2006/main" xmlns:w14="http://schemas.microsoft.com/office/word/2010/wordml" xmlns:w15="http://schemas.microsoft.com/office/word/2012/wordml" xmlns:w16cex="http://schemas.microsoft.com/office/word/2018/wordml/cex" xmlns:w16cid="http://schemas.microsoft.com/office/word/2016/wordml/cid" xmlns:w16="http://schemas.microsoft.com/office/word/2018/wordml" xmlns:w16du="http://schemas.microsoft.com/office/word/2023/wordml/word16du" xmlns:w16sdtdh="http://schemas.microsoft.com/office/word/2020/wordml/sdtdatahash" xmlns:w16sdtfl="http://schemas.microsoft.com/office/word/2024/wordml/sdtformatlock" xmlns:w16se="http://schemas.microsoft.com/office/word/2015/wordml/symex" xmlns:wpg="http://schemas.microsoft.com/office/word/2010/wordprocessingGroup" xmlns:wpi="http://schemas.microsoft.com/office/word/2010/wordprocessingInk" xmlns:wne="http://schemas.microsoft.com/office/word/2006/wordml" xmlns:wps="http://schemas.microsoft.com/office/word/2010/wordprocessingShape" mc:Ignorable="w14 w15 w16se w16cid w16 w16cex w16sdtdh w16sdtfl w16du wp14">
   <w:abstractNum w:abstractNumId="0" w15:restartNumberingAfterBreak="0">
+    <w:nsid w:val="27E1208D"/>
+    <w:multiLevelType w:val="hybridMultilevel"/>
+    <w:tmpl w:val="3D3C99D0"/>
+    <w:lvl w:ilvl="0" w:tplc="FFFFFFFF">
+      <w:start w:val="1"/>
+      <w:numFmt w:val="bullet"/>
+      <w:lvlText w:val="‐"/>
+      <w:lvlJc w:val="left"/>
+      <w:pPr>
+        <w:ind w:left="720" w:hanging="360"/>
+      </w:pPr>
+      <w:rPr>
+        <w:rFonts w:ascii="Times New Roman" w:hAnsi="Times New Roman" w:cs="Times New Roman" w:hint="default"/>
+      </w:rPr>
+    </w:lvl>
+    <w:lvl w:ilvl="1" w:tplc="04090001">
+      <w:start w:val="1"/>
+      <w:numFmt w:val="bullet"/>
+      <w:lvlText w:val=""/>
+      <w:lvlJc w:val="left"/>
+      <w:pPr>
+        <w:ind w:left="1440" w:hanging="360"/>
+      </w:pPr>
+      <w:rPr>
+        <w:rFonts w:ascii="Symbol" w:hAnsi="Symbol" w:hint="default"/>
+      </w:rPr>
+    </w:lvl>
+    <w:lvl w:ilvl="2" w:tplc="FFFFFFFF" w:tentative="1">
+      <w:start w:val="1"/>
+      <w:numFmt w:val="bullet"/>
+      <w:lvlText w:val=""/>
+      <w:lvlJc w:val="left"/>
+      <w:pPr>
+        <w:ind w:left="2160" w:hanging="360"/>
+      </w:pPr>
+      <w:rPr>
+        <w:rFonts w:ascii="Wingdings" w:hAnsi="Wingdings" w:hint="default"/>
+      </w:rPr>
+    </w:lvl>
+    <w:lvl w:ilvl="3" w:tplc="FFFFFFFF" w:tentative="1">
+      <w:start w:val="1"/>
+      <w:numFmt w:val="bullet"/>
+      <w:lvlText w:val=""/>
+      <w:lvlJc w:val="left"/>
+      <w:pPr>
+        <w:ind w:left="2880" w:hanging="360"/>
+      </w:pPr>
+      <w:rPr>
+        <w:rFonts w:ascii="Symbol" w:hAnsi="Symbol" w:hint="default"/>
+      </w:rPr>
+    </w:lvl>
+    <w:lvl w:ilvl="4" w:tplc="FFFFFFFF" w:tentative="1">
+      <w:start w:val="1"/>
+      <w:numFmt w:val="bullet"/>
+      <w:lvlText w:val="o"/>
+      <w:lvlJc w:val="left"/>
+      <w:pPr>
+        <w:ind w:left="3600" w:hanging="360"/>
+      </w:pPr>
+      <w:rPr>
+        <w:rFonts w:ascii="Courier New" w:hAnsi="Courier New" w:cs="Courier New" w:hint="default"/>
+      </w:rPr>
+    </w:lvl>
+    <w:lvl w:ilvl="5" w:tplc="FFFFFFFF" w:tentative="1">
+      <w:start w:val="1"/>
+      <w:numFmt w:val="bullet"/>
+      <w:lvlText w:val=""/>
+      <w:lvlJc w:val="left"/>
+      <w:pPr>
+        <w:ind w:left="4320" w:hanging="360"/>
+      </w:pPr>
+      <w:rPr>
+        <w:rFonts w:ascii="Wingdings" w:hAnsi="Wingdings" w:hint="default"/>
+      </w:rPr>
+    </w:lvl>
+    <w:lvl w:ilvl="6" w:tplc="FFFFFFFF" w:tentative="1">
+      <w:start w:val="1"/>
+      <w:numFmt w:val="bullet"/>
+      <w:lvlText w:val=""/>
+      <w:lvlJc w:val="left"/>
+      <w:pPr>
+        <w:ind w:left="5040" w:hanging="360"/>
+      </w:pPr>
+      <w:rPr>
+        <w:rFonts w:ascii="Symbol" w:hAnsi="Symbol" w:hint="default"/>
+      </w:rPr>
+    </w:lvl>
+    <w:lvl w:ilvl="7" w:tplc="FFFFFFFF" w:tentative="1">
+      <w:start w:val="1"/>
+      <w:numFmt w:val="bullet"/>
+      <w:lvlText w:val="o"/>
+      <w:lvlJc w:val="left"/>
+      <w:pPr>
+        <w:ind w:left="5760" w:hanging="360"/>
+      </w:pPr>
+      <w:rPr>
+        <w:rFonts w:ascii="Courier New" w:hAnsi="Courier New" w:cs="Courier New" w:hint="default"/>
+      </w:rPr>
+    </w:lvl>
+    <w:lvl w:ilvl="8" w:tplc="FFFFFFFF" w:tentative="1">
+      <w:start w:val="1"/>
+      <w:numFmt w:val="bullet"/>
+      <w:lvlText w:val=""/>
+      <w:lvlJc w:val="left"/>
+      <w:pPr>
+        <w:ind w:left="6480" w:hanging="360"/>
+      </w:pPr>
+      <w:rPr>
+        <w:rFonts w:ascii="Wingdings" w:hAnsi="Wingdings" w:hint="default"/>
+      </w:rPr>
+    </w:lvl>
+  </w:abstractNum>
+  <w:abstractNum w:abstractNumId="1" w15:restartNumberingAfterBreak="0">
+    <w:nsid w:val="3E9D3D0C"/>
+    <w:multiLevelType w:val="hybridMultilevel"/>
+    <w:tmpl w:val="6E1E0556"/>
+    <w:lvl w:ilvl="0" w:tplc="81B0E3B0">
+      <w:numFmt w:val="bullet"/>
+      <w:lvlText w:val="-"/>
+      <w:lvlJc w:val="left"/>
+      <w:pPr>
+        <w:ind w:left="720" w:hanging="360"/>
+      </w:pPr>
+      <w:rPr>
+        <w:rFonts w:ascii="Times New Roman" w:eastAsia="Times New Roman" w:hAnsi="Times New Roman" w:cs="Times New Roman" w:hint="default"/>
+      </w:rPr>
+    </w:lvl>
+    <w:lvl w:ilvl="1" w:tplc="04090003" w:tentative="1">
+      <w:start w:val="1"/>
+      <w:numFmt w:val="bullet"/>
+      <w:lvlText w:val="o"/>
+      <w:lvlJc w:val="left"/>
+      <w:pPr>
+        <w:ind w:left="1440" w:hanging="360"/>
+      </w:pPr>
+      <w:rPr>
+        <w:rFonts w:ascii="Courier New" w:hAnsi="Courier New" w:cs="Courier New" w:hint="default"/>
+      </w:rPr>
+    </w:lvl>
+    <w:lvl w:ilvl="2" w:tplc="04090005" w:tentative="1">
+      <w:start w:val="1"/>
+      <w:numFmt w:val="bullet"/>
+      <w:lvlText w:val=""/>
+      <w:lvlJc w:val="left"/>
+      <w:pPr>
+        <w:ind w:left="2160" w:hanging="360"/>
+      </w:pPr>
+      <w:rPr>
+        <w:rFonts w:ascii="Wingdings" w:hAnsi="Wingdings" w:hint="default"/>
+      </w:rPr>
+    </w:lvl>
+    <w:lvl w:ilvl="3" w:tplc="04090001" w:tentative="1">
+      <w:start w:val="1"/>
+      <w:numFmt w:val="bullet"/>
+      <w:lvlText w:val=""/>
+      <w:lvlJc w:val="left"/>
+      <w:pPr>
+        <w:ind w:left="2880" w:hanging="360"/>
+      </w:pPr>
+      <w:rPr>
+        <w:rFonts w:ascii="Symbol" w:hAnsi="Symbol" w:hint="default"/>
+      </w:rPr>
+    </w:lvl>
+    <w:lvl w:ilvl="4" w:tplc="04090003" w:tentative="1">
+      <w:start w:val="1"/>
+      <w:numFmt w:val="bullet"/>
+      <w:lvlText w:val="o"/>
+      <w:lvlJc w:val="left"/>
+      <w:pPr>
+        <w:ind w:left="3600" w:hanging="360"/>
+      </w:pPr>
+      <w:rPr>
+        <w:rFonts w:ascii="Courier New" w:hAnsi="Courier New" w:cs="Courier New" w:hint="default"/>
+      </w:rPr>
+    </w:lvl>
+    <w:lvl w:ilvl="5" w:tplc="04090005" w:tentative="1">
+      <w:start w:val="1"/>
+      <w:numFmt w:val="bullet"/>
+      <w:lvlText w:val=""/>
+      <w:lvlJc w:val="left"/>
+      <w:pPr>
+        <w:ind w:left="4320" w:hanging="360"/>
+      </w:pPr>
+      <w:rPr>
+        <w:rFonts w:ascii="Wingdings" w:hAnsi="Wingdings" w:hint="default"/>
+      </w:rPr>
+    </w:lvl>
+    <w:lvl w:ilvl="6" w:tplc="04090001" w:tentative="1">
+      <w:start w:val="1"/>
+      <w:numFmt w:val="bullet"/>
+      <w:lvlText w:val=""/>
+      <w:lvlJc w:val="left"/>
+      <w:pPr>
+        <w:ind w:left="5040" w:hanging="360"/>
+      </w:pPr>
+      <w:rPr>
+        <w:rFonts w:ascii="Symbol" w:hAnsi="Symbol" w:hint="default"/>
+      </w:rPr>
+    </w:lvl>
+    <w:lvl w:ilvl="7" w:tplc="04090003" w:tentative="1">
+      <w:start w:val="1"/>
+      <w:numFmt w:val="bullet"/>
+      <w:lvlText w:val="o"/>
+      <w:lvlJc w:val="left"/>
+      <w:pPr>
+        <w:ind w:left="5760" w:hanging="360"/>
+      </w:pPr>
+      <w:rPr>
+        <w:rFonts w:ascii="Courier New" w:hAnsi="Courier New" w:cs="Courier New" w:hint="default"/>
+      </w:rPr>
+    </w:lvl>
+    <w:lvl w:ilvl="8" w:tplc="04090005" w:tentative="1">
+      <w:start w:val="1"/>
+      <w:numFmt w:val="bullet"/>
+      <w:lvlText w:val=""/>
+      <w:lvlJc w:val="left"/>
+      <w:pPr>
+        <w:ind w:left="6480" w:hanging="360"/>
+      </w:pPr>
+      <w:rPr>
+        <w:rFonts w:ascii="Wingdings" w:hAnsi="Wingdings" w:hint="default"/>
+      </w:rPr>
+    </w:lvl>
+  </w:abstractNum>
+  <w:abstractNum w:abstractNumId="2" w15:restartNumberingAfterBreak="0">
+    <w:nsid w:val="68FD7645"/>
+    <w:multiLevelType w:val="hybridMultilevel"/>
+    <w:tmpl w:val="1596A3DE"/>
+    <w:lvl w:ilvl="0" w:tplc="9B06D73A">
+      <w:start w:val="1"/>
+      <w:numFmt w:val="bullet"/>
+      <w:lvlText w:val="‐"/>
+      <w:lvlJc w:val="left"/>
+      <w:pPr>
+        <w:ind w:left="720" w:hanging="360"/>
+      </w:pPr>
+      <w:rPr>
+        <w:rFonts w:ascii="Times New Roman" w:hAnsi="Times New Roman" w:cs="Times New Roman" w:hint="default"/>
+      </w:rPr>
+    </w:lvl>
+    <w:lvl w:ilvl="1" w:tplc="04090003">
+      <w:start w:val="1"/>
+      <w:numFmt w:val="bullet"/>
+      <w:lvlText w:val="o"/>
+      <w:lvlJc w:val="left"/>
+      <w:pPr>
+        <w:ind w:left="1440" w:hanging="360"/>
+      </w:pPr>
+      <w:rPr>
+        <w:rFonts w:ascii="Courier New" w:hAnsi="Courier New" w:cs="Courier New" w:hint="default"/>
+      </w:rPr>
+    </w:lvl>
+    <w:lvl w:ilvl="2" w:tplc="04090005" w:tentative="1">
+      <w:start w:val="1"/>
+      <w:numFmt w:val="bullet"/>
+      <w:lvlText w:val=""/>
+      <w:lvlJc w:val="left"/>
+      <w:pPr>
+        <w:ind w:left="2160" w:hanging="360"/>
+      </w:pPr>
+      <w:rPr>
+        <w:rFonts w:ascii="Wingdings" w:hAnsi="Wingdings" w:hint="default"/>
+      </w:rPr>
+    </w:lvl>
+    <w:lvl w:ilvl="3" w:tplc="04090001" w:tentative="1">
+      <w:start w:val="1"/>
+      <w:numFmt w:val="bullet"/>
+      <w:lvlText w:val=""/>
+      <w:lvlJc w:val="left"/>
+      <w:pPr>
+        <w:ind w:left="2880" w:hanging="360"/>
+      </w:pPr>
+      <w:rPr>
+        <w:rFonts w:ascii="Symbol" w:hAnsi="Symbol" w:hint="default"/>
+      </w:rPr>
+    </w:lvl>
+    <w:lvl w:ilvl="4" w:tplc="04090003" w:tentative="1">
+      <w:start w:val="1"/>
+      <w:numFmt w:val="bullet"/>
+      <w:lvlText w:val="o"/>
+      <w:lvlJc w:val="left"/>
+      <w:pPr>
+        <w:ind w:left="3600" w:hanging="360"/>
+      </w:pPr>
+      <w:rPr>
+        <w:rFonts w:ascii="Courier New" w:hAnsi="Courier New" w:cs="Courier New" w:hint="default"/>
+      </w:rPr>
+    </w:lvl>
+    <w:lvl w:ilvl="5" w:tplc="04090005" w:tentative="1">
+      <w:start w:val="1"/>
+      <w:numFmt w:val="bullet"/>
+      <w:lvlText w:val=""/>
+      <w:lvlJc w:val="left"/>
+      <w:pPr>
+        <w:ind w:left="4320" w:hanging="360"/>
+      </w:pPr>
+      <w:rPr>
+        <w:rFonts w:ascii="Wingdings" w:hAnsi="Wingdings" w:hint="default"/>
+      </w:rPr>
+    </w:lvl>
+    <w:lvl w:ilvl="6" w:tplc="04090001" w:tentative="1">
+      <w:start w:val="1"/>
+      <w:numFmt w:val="bullet"/>
+      <w:lvlText w:val=""/>
+      <w:lvlJc w:val="left"/>
+      <w:pPr>
+        <w:ind w:left="5040" w:hanging="360"/>
+      </w:pPr>
+      <w:rPr>
+        <w:rFonts w:ascii="Symbol" w:hAnsi="Symbol" w:hint="default"/>
+      </w:rPr>
+    </w:lvl>
+    <w:lvl w:ilvl="7" w:tplc="04090003" w:tentative="1">
+      <w:start w:val="1"/>
+      <w:numFmt w:val="bullet"/>
+      <w:lvlText w:val="o"/>
+      <w:lvlJc w:val="left"/>
+      <w:pPr>
+        <w:ind w:left="5760" w:hanging="360"/>
+      </w:pPr>
+      <w:rPr>
+        <w:rFonts w:ascii="Courier New" w:hAnsi="Courier New" w:cs="Courier New" w:hint="default"/>
+      </w:rPr>
+    </w:lvl>
+    <w:lvl w:ilvl="8" w:tplc="04090005" w:tentative="1">
+      <w:start w:val="1"/>
+      <w:numFmt w:val="bullet"/>
+      <w:lvlText w:val=""/>
+      <w:lvlJc w:val="left"/>
+      <w:pPr>
+        <w:ind w:left="6480" w:hanging="360"/>
+      </w:pPr>
+      <w:rPr>
+        <w:rFonts w:ascii="Wingdings" w:hAnsi="Wingdings" w:hint="default"/>
+      </w:rPr>
+    </w:lvl>
+  </w:abstractNum>
+  <w:abstractNum w:abstractNumId="3" w15:restartNumberingAfterBreak="0">
     <w:nsid w:val="7ED04494"/>
     <w:multiLevelType w:val="hybridMultilevel"/>
     <w:tmpl w:val="522A7E18"/>
@@ -11916,6 +12285,15 @@
     </w:lvl>
   </w:abstractNum>
   <w:num w:numId="1" w16cid:durableId="1178616268">
+    <w:abstractNumId w:val="3"/>
+  </w:num>
+  <w:num w:numId="2" w16cid:durableId="836269863">
+    <w:abstractNumId w:val="2"/>
+  </w:num>
+  <w:num w:numId="3" w16cid:durableId="2711406">
+    <w:abstractNumId w:val="1"/>
+  </w:num>
+  <w:num w:numId="4" w16cid:durableId="2070420245">
     <w:abstractNumId w:val="0"/>
   </w:num>
 </w:numbering>

</xml_diff>